<commit_message>
Making the logo of the application (+documentation update)
</commit_message>
<xml_diff>
--- a/tests_documentation.docx
+++ b/tests_documentation.docx
@@ -24,307 +24,6 @@
         <w:t>TESZTEK DOKUMENTÁCIÓJA</w:t>
       </w:r>
     </w:p>
-    <w:p>
-      <w:pPr>
-        <w:jc w:val="center"/>
-        <w:rPr>
-          <w:rFonts w:ascii="Times New Roman" w:hAnsi="Times New Roman" w:cs="Times New Roman"/>
-          <w:b/>
-          <w:bCs/>
-          <w:sz w:val="40"/>
-          <w:szCs w:val="40"/>
-        </w:rPr>
-      </w:pPr>
-    </w:p>
-    <w:p>
-      <w:pPr>
-        <w:pStyle w:val="Listaszerbekezds"/>
-        <w:numPr>
-          <w:ilvl w:val="0"/>
-          <w:numId w:val="1"/>
-        </w:numPr>
-        <w:jc w:val="both"/>
-        <w:rPr>
-          <w:rFonts w:ascii="Times New Roman" w:hAnsi="Times New Roman" w:cs="Times New Roman"/>
-          <w:sz w:val="36"/>
-          <w:szCs w:val="36"/>
-        </w:rPr>
-      </w:pPr>
-      <w:r>
-        <w:rPr>
-          <w:rFonts w:ascii="Times New Roman" w:hAnsi="Times New Roman" w:cs="Times New Roman"/>
-          <w:sz w:val="36"/>
-          <w:szCs w:val="36"/>
-        </w:rPr>
-        <w:t>2026-03-09</w:t>
-      </w:r>
-    </w:p>
-    <w:p>
-      <w:pPr>
-        <w:pStyle w:val="Listaszerbekezds"/>
-        <w:jc w:val="both"/>
-        <w:rPr>
-          <w:rFonts w:ascii="Times New Roman" w:hAnsi="Times New Roman" w:cs="Times New Roman"/>
-          <w:sz w:val="36"/>
-          <w:szCs w:val="36"/>
-        </w:rPr>
-      </w:pPr>
-      <w:r>
-        <w:rPr>
-          <w:rFonts w:ascii="Times New Roman" w:hAnsi="Times New Roman" w:cs="Times New Roman"/>
-          <w:sz w:val="36"/>
-          <w:szCs w:val="36"/>
-        </w:rPr>
-        <w:t>Az oldalak elérhetőségének tesztelése: a felhasználó el tud jutni a bejelentkezési képernyőhöz, emellett a bejelentkezett állapotú főoldalakról megoldott a kilépés (hivatkozás szinten!) és a többi nézet elérése is.</w:t>
-      </w:r>
-    </w:p>
-    <w:p>
-      <w:pPr>
-        <w:pStyle w:val="Listaszerbekezds"/>
-        <w:jc w:val="both"/>
-        <w:rPr>
-          <w:rFonts w:ascii="Times New Roman" w:hAnsi="Times New Roman" w:cs="Times New Roman"/>
-          <w:sz w:val="36"/>
-          <w:szCs w:val="36"/>
-        </w:rPr>
-      </w:pPr>
-    </w:p>
-    <w:p>
-      <w:pPr>
-        <w:pStyle w:val="Listaszerbekezds"/>
-        <w:jc w:val="both"/>
-        <w:rPr>
-          <w:rFonts w:ascii="Times New Roman" w:hAnsi="Times New Roman" w:cs="Times New Roman"/>
-          <w:sz w:val="36"/>
-          <w:szCs w:val="36"/>
-        </w:rPr>
-      </w:pPr>
-      <w:r>
-        <w:rPr>
-          <w:rFonts w:ascii="Times New Roman" w:hAnsi="Times New Roman" w:cs="Times New Roman"/>
-          <w:sz w:val="36"/>
-          <w:szCs w:val="36"/>
-        </w:rPr>
-        <w:t>Tesztekhez végzett kód:</w:t>
-      </w:r>
-    </w:p>
-    <w:p>
-      <w:pPr>
-        <w:pStyle w:val="Listaszerbekezds"/>
-        <w:ind w:left="0"/>
-        <w:jc w:val="both"/>
-        <w:rPr>
-          <w:rFonts w:ascii="Times New Roman" w:hAnsi="Times New Roman" w:cs="Times New Roman"/>
-          <w:sz w:val="36"/>
-          <w:szCs w:val="36"/>
-        </w:rPr>
-      </w:pPr>
-      <w:r>
-        <w:rPr>
-          <w:rFonts w:ascii="Times New Roman" w:hAnsi="Times New Roman" w:cs="Times New Roman"/>
-          <w:sz w:val="36"/>
-          <w:szCs w:val="36"/>
-        </w:rPr>
-        <w:drawing>
-          <wp:inline distT="0" distB="0" distL="0" distR="0" wp14:anchorId="06BB8069" wp14:editId="65BED8DF">
-            <wp:extent cx="5760720" cy="2458720"/>
-            <wp:effectExtent l="0" t="0" r="0" b="0"/>
-            <wp:docPr id="430320589" name="Kép 1"/>
-            <wp:cNvGraphicFramePr>
-              <a:graphicFrameLocks xmlns:a="http://schemas.openxmlformats.org/drawingml/2006/main" noChangeAspect="1"/>
-            </wp:cNvGraphicFramePr>
-            <a:graphic xmlns:a="http://schemas.openxmlformats.org/drawingml/2006/main">
-              <a:graphicData uri="http://schemas.openxmlformats.org/drawingml/2006/picture">
-                <pic:pic xmlns:pic="http://schemas.openxmlformats.org/drawingml/2006/picture">
-                  <pic:nvPicPr>
-                    <pic:cNvPr id="430320589" name=""/>
-                    <pic:cNvPicPr/>
-                  </pic:nvPicPr>
-                  <pic:blipFill>
-                    <a:blip r:embed="rId5"/>
-                    <a:stretch>
-                      <a:fillRect/>
-                    </a:stretch>
-                  </pic:blipFill>
-                  <pic:spPr>
-                    <a:xfrm>
-                      <a:off x="0" y="0"/>
-                      <a:ext cx="5760720" cy="2458720"/>
-                    </a:xfrm>
-                    <a:prstGeom prst="rect">
-                      <a:avLst/>
-                    </a:prstGeom>
-                  </pic:spPr>
-                </pic:pic>
-              </a:graphicData>
-            </a:graphic>
-          </wp:inline>
-        </w:drawing>
-      </w:r>
-    </w:p>
-    <w:p>
-      <w:pPr>
-        <w:pStyle w:val="Listaszerbekezds"/>
-        <w:ind w:left="0"/>
-        <w:jc w:val="both"/>
-        <w:rPr>
-          <w:rFonts w:ascii="Times New Roman" w:hAnsi="Times New Roman" w:cs="Times New Roman"/>
-          <w:sz w:val="36"/>
-          <w:szCs w:val="36"/>
-        </w:rPr>
-      </w:pPr>
-      <w:r>
-        <w:rPr>
-          <w:rFonts w:ascii="Times New Roman" w:hAnsi="Times New Roman" w:cs="Times New Roman"/>
-          <w:sz w:val="36"/>
-          <w:szCs w:val="36"/>
-        </w:rPr>
-        <w:drawing>
-          <wp:inline distT="0" distB="0" distL="0" distR="0" wp14:anchorId="2516358C" wp14:editId="0A3A7884">
-            <wp:extent cx="5760720" cy="2953385"/>
-            <wp:effectExtent l="0" t="0" r="0" b="0"/>
-            <wp:docPr id="1399800654" name="Kép 1"/>
-            <wp:cNvGraphicFramePr>
-              <a:graphicFrameLocks xmlns:a="http://schemas.openxmlformats.org/drawingml/2006/main" noChangeAspect="1"/>
-            </wp:cNvGraphicFramePr>
-            <a:graphic xmlns:a="http://schemas.openxmlformats.org/drawingml/2006/main">
-              <a:graphicData uri="http://schemas.openxmlformats.org/drawingml/2006/picture">
-                <pic:pic xmlns:pic="http://schemas.openxmlformats.org/drawingml/2006/picture">
-                  <pic:nvPicPr>
-                    <pic:cNvPr id="1399800654" name=""/>
-                    <pic:cNvPicPr/>
-                  </pic:nvPicPr>
-                  <pic:blipFill>
-                    <a:blip r:embed="rId6"/>
-                    <a:stretch>
-                      <a:fillRect/>
-                    </a:stretch>
-                  </pic:blipFill>
-                  <pic:spPr>
-                    <a:xfrm>
-                      <a:off x="0" y="0"/>
-                      <a:ext cx="5760720" cy="2953385"/>
-                    </a:xfrm>
-                    <a:prstGeom prst="rect">
-                      <a:avLst/>
-                    </a:prstGeom>
-                  </pic:spPr>
-                </pic:pic>
-              </a:graphicData>
-            </a:graphic>
-          </wp:inline>
-        </w:drawing>
-      </w:r>
-    </w:p>
-    <w:p>
-      <w:pPr>
-        <w:pStyle w:val="Listaszerbekezds"/>
-        <w:ind w:left="0"/>
-        <w:jc w:val="both"/>
-        <w:rPr>
-          <w:rFonts w:ascii="Times New Roman" w:hAnsi="Times New Roman" w:cs="Times New Roman"/>
-          <w:sz w:val="36"/>
-          <w:szCs w:val="36"/>
-        </w:rPr>
-      </w:pPr>
-      <w:r>
-        <w:rPr>
-          <w:rFonts w:ascii="Times New Roman" w:hAnsi="Times New Roman" w:cs="Times New Roman"/>
-          <w:sz w:val="36"/>
-          <w:szCs w:val="36"/>
-        </w:rPr>
-        <w:lastRenderedPageBreak/>
-        <w:drawing>
-          <wp:inline distT="0" distB="0" distL="0" distR="0" wp14:anchorId="115CA553" wp14:editId="09029C08">
-            <wp:extent cx="5760720" cy="3543300"/>
-            <wp:effectExtent l="0" t="0" r="0" b="0"/>
-            <wp:docPr id="75315706" name="Kép 1"/>
-            <wp:cNvGraphicFramePr>
-              <a:graphicFrameLocks xmlns:a="http://schemas.openxmlformats.org/drawingml/2006/main" noChangeAspect="1"/>
-            </wp:cNvGraphicFramePr>
-            <a:graphic xmlns:a="http://schemas.openxmlformats.org/drawingml/2006/main">
-              <a:graphicData uri="http://schemas.openxmlformats.org/drawingml/2006/picture">
-                <pic:pic xmlns:pic="http://schemas.openxmlformats.org/drawingml/2006/picture">
-                  <pic:nvPicPr>
-                    <pic:cNvPr id="75315706" name=""/>
-                    <pic:cNvPicPr/>
-                  </pic:nvPicPr>
-                  <pic:blipFill>
-                    <a:blip r:embed="rId7"/>
-                    <a:stretch>
-                      <a:fillRect/>
-                    </a:stretch>
-                  </pic:blipFill>
-                  <pic:spPr>
-                    <a:xfrm>
-                      <a:off x="0" y="0"/>
-                      <a:ext cx="5760720" cy="3543300"/>
-                    </a:xfrm>
-                    <a:prstGeom prst="rect">
-                      <a:avLst/>
-                    </a:prstGeom>
-                  </pic:spPr>
-                </pic:pic>
-              </a:graphicData>
-            </a:graphic>
-          </wp:inline>
-        </w:drawing>
-      </w:r>
-    </w:p>
-    <w:p>
-      <w:pPr>
-        <w:pStyle w:val="Listaszerbekezds"/>
-        <w:ind w:left="0"/>
-        <w:jc w:val="both"/>
-        <w:rPr>
-          <w:rFonts w:ascii="Times New Roman" w:hAnsi="Times New Roman" w:cs="Times New Roman"/>
-          <w:sz w:val="36"/>
-          <w:szCs w:val="36"/>
-        </w:rPr>
-      </w:pPr>
-      <w:r>
-        <w:rPr>
-          <w:rFonts w:ascii="Times New Roman" w:hAnsi="Times New Roman" w:cs="Times New Roman"/>
-          <w:sz w:val="36"/>
-          <w:szCs w:val="36"/>
-        </w:rPr>
-        <w:drawing>
-          <wp:inline distT="0" distB="0" distL="0" distR="0" wp14:anchorId="1D133DF6" wp14:editId="6A2CE0D3">
-            <wp:extent cx="5760720" cy="3220085"/>
-            <wp:effectExtent l="0" t="0" r="0" b="0"/>
-            <wp:docPr id="240538489" name="Kép 1"/>
-            <wp:cNvGraphicFramePr>
-              <a:graphicFrameLocks xmlns:a="http://schemas.openxmlformats.org/drawingml/2006/main" noChangeAspect="1"/>
-            </wp:cNvGraphicFramePr>
-            <a:graphic xmlns:a="http://schemas.openxmlformats.org/drawingml/2006/main">
-              <a:graphicData uri="http://schemas.openxmlformats.org/drawingml/2006/picture">
-                <pic:pic xmlns:pic="http://schemas.openxmlformats.org/drawingml/2006/picture">
-                  <pic:nvPicPr>
-                    <pic:cNvPr id="240538489" name=""/>
-                    <pic:cNvPicPr/>
-                  </pic:nvPicPr>
-                  <pic:blipFill>
-                    <a:blip r:embed="rId8"/>
-                    <a:stretch>
-                      <a:fillRect/>
-                    </a:stretch>
-                  </pic:blipFill>
-                  <pic:spPr>
-                    <a:xfrm>
-                      <a:off x="0" y="0"/>
-                      <a:ext cx="5760720" cy="3220085"/>
-                    </a:xfrm>
-                    <a:prstGeom prst="rect">
-                      <a:avLst/>
-                    </a:prstGeom>
-                  </pic:spPr>
-                </pic:pic>
-              </a:graphicData>
-            </a:graphic>
-          </wp:inline>
-        </w:drawing>
-      </w:r>
-    </w:p>
     <w:sectPr>
       <w:pgSz w:w="11906" w:h="16838"/>
       <w:pgMar w:top="1417" w:right="1417" w:bottom="1417" w:left="1417" w:header="708" w:footer="708" w:gutter="0"/>
@@ -333,103 +32,6 @@
     </w:sectPr>
   </w:body>
 </w:document>
-</file>
-
-<file path=word/numbering.xml><?xml version="1.0" encoding="utf-8"?>
-<w:numbering xmlns:wpc="http://schemas.microsoft.com/office/word/2010/wordprocessingCanvas" xmlns:cx="http://schemas.microsoft.com/office/drawing/2014/chartex" xmlns:cx1="http://schemas.microsoft.com/office/drawing/2015/9/8/chartex" xmlns:cx2="http://schemas.microsoft.com/office/drawing/2015/10/21/chartex" xmlns:cx3="http://schemas.microsoft.com/office/drawing/2016/5/9/chartex" xmlns:cx4="http://schemas.microsoft.com/office/drawing/2016/5/10/chartex" xmlns:cx5="http://schemas.microsoft.com/office/drawing/2016/5/11/chartex" xmlns:cx6="http://schemas.microsoft.com/office/drawing/2016/5/12/chartex" xmlns:cx7="http://schemas.microsoft.com/office/drawing/2016/5/13/chartex" xmlns:cx8="http://schemas.microsoft.com/office/drawing/2016/5/14/chartex" xmlns:mc="http://schemas.openxmlformats.org/markup-compatibility/2006" xmlns:aink="http://schemas.microsoft.com/office/drawing/2016/ink" xmlns:am3d="http://schemas.microsoft.com/office/drawing/2017/model3d" xmlns:o="urn:schemas-microsoft-com:office:office" xmlns:oel="http://schemas.microsoft.com/office/2019/extlst" xmlns:r="http://schemas.openxmlformats.org/officeDocument/2006/relationships" xmlns:m="http://schemas.openxmlformats.org/officeDocument/2006/math" xmlns:v="urn:schemas-microsoft-com:vml" xmlns:wp14="http://schemas.microsoft.com/office/word/2010/wordprocessingDrawing" xmlns:wp="http://schemas.openxmlformats.org/drawingml/2006/wordprocessingDrawing" xmlns:w10="urn:schemas-microsoft-com:office:word" xmlns:w="http://schemas.openxmlformats.org/wordprocessingml/2006/main" xmlns:w14="http://schemas.microsoft.com/office/word/2010/wordml" xmlns:w15="http://schemas.microsoft.com/office/word/2012/wordml" xmlns:w16cex="http://schemas.microsoft.com/office/word/2018/wordml/cex" xmlns:w16cid="http://schemas.microsoft.com/office/word/2016/wordml/cid" xmlns:w16="http://schemas.microsoft.com/office/word/2018/wordml" xmlns:w16du="http://schemas.microsoft.com/office/word/2023/wordml/word16du" xmlns:w16sdtdh="http://schemas.microsoft.com/office/word/2020/wordml/sdtdatahash" xmlns:w16sdtfl="http://schemas.microsoft.com/office/word/2024/wordml/sdtformatlock" xmlns:w16se="http://schemas.microsoft.com/office/word/2015/wordml/symex" xmlns:wpg="http://schemas.microsoft.com/office/word/2010/wordprocessingGroup" xmlns:wpi="http://schemas.microsoft.com/office/word/2010/wordprocessingInk" xmlns:wne="http://schemas.microsoft.com/office/word/2006/wordml" xmlns:wps="http://schemas.microsoft.com/office/word/2010/wordprocessingShape" mc:Ignorable="w14 w15 w16se w16cid w16 w16cex w16sdtdh w16sdtfl w16du wp14">
-  <w:abstractNum w:abstractNumId="0" w15:restartNumberingAfterBreak="0">
-    <w:nsid w:val="29527466"/>
-    <w:multiLevelType w:val="hybridMultilevel"/>
-    <w:tmpl w:val="6AC48288"/>
-    <w:lvl w:ilvl="0" w:tplc="040E000F">
-      <w:start w:val="1"/>
-      <w:numFmt w:val="decimal"/>
-      <w:lvlText w:val="%1."/>
-      <w:lvlJc w:val="left"/>
-      <w:pPr>
-        <w:ind w:left="720" w:hanging="360"/>
-      </w:pPr>
-      <w:rPr>
-        <w:rFonts w:hint="default"/>
-      </w:rPr>
-    </w:lvl>
-    <w:lvl w:ilvl="1" w:tplc="040E0019" w:tentative="1">
-      <w:start w:val="1"/>
-      <w:numFmt w:val="lowerLetter"/>
-      <w:lvlText w:val="%2."/>
-      <w:lvlJc w:val="left"/>
-      <w:pPr>
-        <w:ind w:left="1440" w:hanging="360"/>
-      </w:pPr>
-    </w:lvl>
-    <w:lvl w:ilvl="2" w:tplc="040E001B" w:tentative="1">
-      <w:start w:val="1"/>
-      <w:numFmt w:val="lowerRoman"/>
-      <w:lvlText w:val="%3."/>
-      <w:lvlJc w:val="right"/>
-      <w:pPr>
-        <w:ind w:left="2160" w:hanging="180"/>
-      </w:pPr>
-    </w:lvl>
-    <w:lvl w:ilvl="3" w:tplc="040E000F" w:tentative="1">
-      <w:start w:val="1"/>
-      <w:numFmt w:val="decimal"/>
-      <w:lvlText w:val="%4."/>
-      <w:lvlJc w:val="left"/>
-      <w:pPr>
-        <w:ind w:left="2880" w:hanging="360"/>
-      </w:pPr>
-    </w:lvl>
-    <w:lvl w:ilvl="4" w:tplc="040E0019" w:tentative="1">
-      <w:start w:val="1"/>
-      <w:numFmt w:val="lowerLetter"/>
-      <w:lvlText w:val="%5."/>
-      <w:lvlJc w:val="left"/>
-      <w:pPr>
-        <w:ind w:left="3600" w:hanging="360"/>
-      </w:pPr>
-    </w:lvl>
-    <w:lvl w:ilvl="5" w:tplc="040E001B" w:tentative="1">
-      <w:start w:val="1"/>
-      <w:numFmt w:val="lowerRoman"/>
-      <w:lvlText w:val="%6."/>
-      <w:lvlJc w:val="right"/>
-      <w:pPr>
-        <w:ind w:left="4320" w:hanging="180"/>
-      </w:pPr>
-    </w:lvl>
-    <w:lvl w:ilvl="6" w:tplc="040E000F" w:tentative="1">
-      <w:start w:val="1"/>
-      <w:numFmt w:val="decimal"/>
-      <w:lvlText w:val="%7."/>
-      <w:lvlJc w:val="left"/>
-      <w:pPr>
-        <w:ind w:left="5040" w:hanging="360"/>
-      </w:pPr>
-    </w:lvl>
-    <w:lvl w:ilvl="7" w:tplc="040E0019" w:tentative="1">
-      <w:start w:val="1"/>
-      <w:numFmt w:val="lowerLetter"/>
-      <w:lvlText w:val="%8."/>
-      <w:lvlJc w:val="left"/>
-      <w:pPr>
-        <w:ind w:left="5760" w:hanging="360"/>
-      </w:pPr>
-    </w:lvl>
-    <w:lvl w:ilvl="8" w:tplc="040E001B" w:tentative="1">
-      <w:start w:val="1"/>
-      <w:numFmt w:val="lowerRoman"/>
-      <w:lvlText w:val="%9."/>
-      <w:lvlJc w:val="right"/>
-      <w:pPr>
-        <w:ind w:left="6480" w:hanging="180"/>
-      </w:pPr>
-    </w:lvl>
-  </w:abstractNum>
-  <w:num w:numId="1" w16cid:durableId="1721786035">
-    <w:abstractNumId w:val="0"/>
-  </w:num>
-</w:numbering>
 </file>
 
 <file path=word/styles.xml><?xml version="1.0" encoding="utf-8"?>
@@ -1035,6 +637,7 @@
   <w:style w:type="character" w:default="1" w:styleId="Bekezdsalapbettpusa">
     <w:name w:val="Default Paragraph Font"/>
     <w:uiPriority w:val="1"/>
+    <w:semiHidden/>
     <w:unhideWhenUsed/>
   </w:style>
   <w:style w:type="table" w:default="1" w:styleId="Normltblzat">

</xml_diff>

<commit_message>
Uploading tests documentation (testing registration)
</commit_message>
<xml_diff>
--- a/tests_documentation.docx
+++ b/tests_documentation.docx
@@ -122,6 +122,7 @@
       <w:r>
         <w:rPr>
           <w:rFonts w:ascii="Times New Roman" w:hAnsi="Times New Roman" w:cs="Times New Roman"/>
+          <w:noProof/>
           <w:sz w:val="36"/>
           <w:szCs w:val="36"/>
         </w:rPr>
@@ -176,6 +177,7 @@
       <w:r>
         <w:rPr>
           <w:rFonts w:ascii="Times New Roman" w:hAnsi="Times New Roman" w:cs="Times New Roman"/>
+          <w:noProof/>
           <w:sz w:val="36"/>
           <w:szCs w:val="36"/>
         </w:rPr>
@@ -230,6 +232,7 @@
       <w:r>
         <w:rPr>
           <w:rFonts w:ascii="Times New Roman" w:hAnsi="Times New Roman" w:cs="Times New Roman"/>
+          <w:noProof/>
           <w:sz w:val="36"/>
           <w:szCs w:val="36"/>
         </w:rPr>
@@ -285,6 +288,7 @@
       <w:r>
         <w:rPr>
           <w:rFonts w:ascii="Times New Roman" w:hAnsi="Times New Roman" w:cs="Times New Roman"/>
+          <w:noProof/>
           <w:sz w:val="36"/>
           <w:szCs w:val="36"/>
         </w:rPr>
@@ -313,6 +317,243 @@
                     <a:xfrm>
                       <a:off x="0" y="0"/>
                       <a:ext cx="5760720" cy="3220085"/>
+                    </a:xfrm>
+                    <a:prstGeom prst="rect">
+                      <a:avLst/>
+                    </a:prstGeom>
+                  </pic:spPr>
+                </pic:pic>
+              </a:graphicData>
+            </a:graphic>
+          </wp:inline>
+        </w:drawing>
+      </w:r>
+    </w:p>
+    <w:p>
+      <w:pPr>
+        <w:pStyle w:val="Listaszerbekezds"/>
+        <w:ind w:left="0"/>
+        <w:jc w:val="both"/>
+        <w:rPr>
+          <w:rFonts w:ascii="Times New Roman" w:hAnsi="Times New Roman" w:cs="Times New Roman"/>
+          <w:sz w:val="36"/>
+          <w:szCs w:val="36"/>
+        </w:rPr>
+      </w:pPr>
+    </w:p>
+    <w:p>
+      <w:pPr>
+        <w:pStyle w:val="Listaszerbekezds"/>
+        <w:numPr>
+          <w:ilvl w:val="0"/>
+          <w:numId w:val="1"/>
+        </w:numPr>
+        <w:jc w:val="both"/>
+        <w:rPr>
+          <w:rFonts w:ascii="Times New Roman" w:hAnsi="Times New Roman" w:cs="Times New Roman"/>
+          <w:sz w:val="36"/>
+          <w:szCs w:val="36"/>
+        </w:rPr>
+      </w:pPr>
+      <w:r>
+        <w:rPr>
+          <w:rFonts w:ascii="Times New Roman" w:hAnsi="Times New Roman" w:cs="Times New Roman"/>
+          <w:sz w:val="36"/>
+          <w:szCs w:val="36"/>
+        </w:rPr>
+        <w:t>2026-04-13</w:t>
+      </w:r>
+    </w:p>
+    <w:p>
+      <w:pPr>
+        <w:jc w:val="both"/>
+        <w:rPr>
+          <w:rFonts w:ascii="Times New Roman" w:hAnsi="Times New Roman" w:cs="Times New Roman"/>
+          <w:sz w:val="36"/>
+          <w:szCs w:val="36"/>
+        </w:rPr>
+      </w:pPr>
+      <w:r>
+        <w:rPr>
+          <w:rFonts w:ascii="Times New Roman" w:hAnsi="Times New Roman" w:cs="Times New Roman"/>
+          <w:sz w:val="36"/>
+          <w:szCs w:val="36"/>
+        </w:rPr>
+        <w:t>Regisztráció tesztelése</w:t>
+      </w:r>
+      <w:r>
+        <w:rPr>
+          <w:rFonts w:ascii="Times New Roman" w:hAnsi="Times New Roman" w:cs="Times New Roman"/>
+          <w:sz w:val="36"/>
+          <w:szCs w:val="36"/>
+        </w:rPr>
+        <w:t>, oldalelérés, adatok bevitele. Jelenleg a regisztráció nem működik az alkalmazásban, de Postmanen keresztül megoldott a helyes adatbevitel.</w:t>
+      </w:r>
+    </w:p>
+    <w:p>
+      <w:pPr>
+        <w:jc w:val="both"/>
+        <w:rPr>
+          <w:rFonts w:ascii="Times New Roman" w:hAnsi="Times New Roman" w:cs="Times New Roman"/>
+          <w:sz w:val="36"/>
+          <w:szCs w:val="36"/>
+        </w:rPr>
+      </w:pPr>
+      <w:r>
+        <w:rPr>
+          <w:rFonts w:ascii="Times New Roman" w:hAnsi="Times New Roman" w:cs="Times New Roman"/>
+          <w:sz w:val="36"/>
+          <w:szCs w:val="36"/>
+        </w:rPr>
+        <w:t>Tesztekhez végzett kód:</w:t>
+      </w:r>
+    </w:p>
+    <w:p>
+      <w:pPr>
+        <w:jc w:val="both"/>
+        <w:rPr>
+          <w:rFonts w:ascii="Times New Roman" w:hAnsi="Times New Roman" w:cs="Times New Roman"/>
+          <w:sz w:val="36"/>
+          <w:szCs w:val="36"/>
+        </w:rPr>
+      </w:pPr>
+      <w:r>
+        <w:rPr>
+          <w:rFonts w:ascii="Times New Roman" w:hAnsi="Times New Roman" w:cs="Times New Roman"/>
+          <w:sz w:val="36"/>
+          <w:szCs w:val="36"/>
+        </w:rPr>
+        <w:lastRenderedPageBreak/>
+        <w:drawing>
+          <wp:inline distT="0" distB="0" distL="0" distR="0" wp14:anchorId="520A2518" wp14:editId="4BE5FFF6">
+            <wp:extent cx="4286907" cy="3581400"/>
+            <wp:effectExtent l="0" t="0" r="0" b="0"/>
+            <wp:docPr id="2074802923" name="Kép 1"/>
+            <wp:cNvGraphicFramePr>
+              <a:graphicFrameLocks xmlns:a="http://schemas.openxmlformats.org/drawingml/2006/main" noChangeAspect="1"/>
+            </wp:cNvGraphicFramePr>
+            <a:graphic xmlns:a="http://schemas.openxmlformats.org/drawingml/2006/main">
+              <a:graphicData uri="http://schemas.openxmlformats.org/drawingml/2006/picture">
+                <pic:pic xmlns:pic="http://schemas.openxmlformats.org/drawingml/2006/picture">
+                  <pic:nvPicPr>
+                    <pic:cNvPr id="2074802923" name=""/>
+                    <pic:cNvPicPr/>
+                  </pic:nvPicPr>
+                  <pic:blipFill>
+                    <a:blip r:embed="rId9"/>
+                    <a:stretch>
+                      <a:fillRect/>
+                    </a:stretch>
+                  </pic:blipFill>
+                  <pic:spPr>
+                    <a:xfrm>
+                      <a:off x="0" y="0"/>
+                      <a:ext cx="4290555" cy="3584448"/>
+                    </a:xfrm>
+                    <a:prstGeom prst="rect">
+                      <a:avLst/>
+                    </a:prstGeom>
+                  </pic:spPr>
+                </pic:pic>
+              </a:graphicData>
+            </a:graphic>
+          </wp:inline>
+        </w:drawing>
+      </w:r>
+    </w:p>
+    <w:p>
+      <w:pPr>
+        <w:jc w:val="both"/>
+        <w:rPr>
+          <w:rFonts w:ascii="Times New Roman" w:hAnsi="Times New Roman" w:cs="Times New Roman"/>
+          <w:sz w:val="36"/>
+          <w:szCs w:val="36"/>
+        </w:rPr>
+      </w:pPr>
+      <w:r>
+        <w:rPr>
+          <w:rFonts w:ascii="Times New Roman" w:hAnsi="Times New Roman" w:cs="Times New Roman"/>
+          <w:sz w:val="36"/>
+          <w:szCs w:val="36"/>
+        </w:rPr>
+        <w:drawing>
+          <wp:inline distT="0" distB="0" distL="0" distR="0" wp14:anchorId="1AD3D812" wp14:editId="40D46FBF">
+            <wp:extent cx="5760720" cy="4892040"/>
+            <wp:effectExtent l="0" t="0" r="0" b="3810"/>
+            <wp:docPr id="1891952295" name="Kép 1"/>
+            <wp:cNvGraphicFramePr>
+              <a:graphicFrameLocks xmlns:a="http://schemas.openxmlformats.org/drawingml/2006/main" noChangeAspect="1"/>
+            </wp:cNvGraphicFramePr>
+            <a:graphic xmlns:a="http://schemas.openxmlformats.org/drawingml/2006/main">
+              <a:graphicData uri="http://schemas.openxmlformats.org/drawingml/2006/picture">
+                <pic:pic xmlns:pic="http://schemas.openxmlformats.org/drawingml/2006/picture">
+                  <pic:nvPicPr>
+                    <pic:cNvPr id="1891952295" name=""/>
+                    <pic:cNvPicPr/>
+                  </pic:nvPicPr>
+                  <pic:blipFill>
+                    <a:blip r:embed="rId10"/>
+                    <a:stretch>
+                      <a:fillRect/>
+                    </a:stretch>
+                  </pic:blipFill>
+                  <pic:spPr>
+                    <a:xfrm>
+                      <a:off x="0" y="0"/>
+                      <a:ext cx="5760720" cy="4892040"/>
+                    </a:xfrm>
+                    <a:prstGeom prst="rect">
+                      <a:avLst/>
+                    </a:prstGeom>
+                  </pic:spPr>
+                </pic:pic>
+              </a:graphicData>
+            </a:graphic>
+          </wp:inline>
+        </w:drawing>
+      </w:r>
+    </w:p>
+    <w:p>
+      <w:pPr>
+        <w:jc w:val="both"/>
+        <w:rPr>
+          <w:rFonts w:ascii="Times New Roman" w:hAnsi="Times New Roman" w:cs="Times New Roman"/>
+          <w:sz w:val="36"/>
+          <w:szCs w:val="36"/>
+        </w:rPr>
+      </w:pPr>
+      <w:r>
+        <w:rPr>
+          <w:rFonts w:ascii="Times New Roman" w:hAnsi="Times New Roman" w:cs="Times New Roman"/>
+          <w:sz w:val="36"/>
+          <w:szCs w:val="36"/>
+        </w:rPr>
+        <w:lastRenderedPageBreak/>
+        <w:drawing>
+          <wp:inline distT="0" distB="0" distL="0" distR="0" wp14:anchorId="71411A0E" wp14:editId="5A0F65EB">
+            <wp:extent cx="5760720" cy="4038600"/>
+            <wp:effectExtent l="0" t="0" r="0" b="0"/>
+            <wp:docPr id="482280050" name="Kép 1"/>
+            <wp:cNvGraphicFramePr>
+              <a:graphicFrameLocks xmlns:a="http://schemas.openxmlformats.org/drawingml/2006/main" noChangeAspect="1"/>
+            </wp:cNvGraphicFramePr>
+            <a:graphic xmlns:a="http://schemas.openxmlformats.org/drawingml/2006/main">
+              <a:graphicData uri="http://schemas.openxmlformats.org/drawingml/2006/picture">
+                <pic:pic xmlns:pic="http://schemas.openxmlformats.org/drawingml/2006/picture">
+                  <pic:nvPicPr>
+                    <pic:cNvPr id="482280050" name=""/>
+                    <pic:cNvPicPr/>
+                  </pic:nvPicPr>
+                  <pic:blipFill>
+                    <a:blip r:embed="rId11"/>
+                    <a:stretch>
+                      <a:fillRect/>
+                    </a:stretch>
+                  </pic:blipFill>
+                  <pic:spPr>
+                    <a:xfrm>
+                      <a:off x="0" y="0"/>
+                      <a:ext cx="5760720" cy="4038600"/>
                     </a:xfrm>
                     <a:prstGeom prst="rect">
                       <a:avLst/>
@@ -1035,6 +1276,7 @@
   <w:style w:type="character" w:default="1" w:styleId="Bekezdsalapbettpusa">
     <w:name w:val="Default Paragraph Font"/>
     <w:uiPriority w:val="1"/>
+    <w:semiHidden/>
     <w:unhideWhenUsed/>
   </w:style>
   <w:style w:type="table" w:default="1" w:styleId="Normltblzat">

</xml_diff>

<commit_message>
Uploading tests' documentation about the music sending (regular documentation already uplodaded)
</commit_message>
<xml_diff>
--- a/tests_documentation.docx
+++ b/tests_documentation.docx
@@ -380,6 +380,699 @@
           <w:szCs w:val="36"/>
         </w:rPr>
         <w:t>Regisztráció tesztelése</w:t>
+      </w:r>
+      <w:r>
+        <w:rPr>
+          <w:rFonts w:ascii="Times New Roman" w:hAnsi="Times New Roman" w:cs="Times New Roman"/>
+          <w:sz w:val="36"/>
+          <w:szCs w:val="36"/>
+        </w:rPr>
+        <w:t>, oldalelérés, adatok bevitele. Jelenleg a regisztráció nem működik az alkalmazásban, de Postmanen keresztül megoldott a helyes adatbevitel.</w:t>
+      </w:r>
+    </w:p>
+    <w:p>
+      <w:pPr>
+        <w:jc w:val="both"/>
+        <w:rPr>
+          <w:rFonts w:ascii="Times New Roman" w:hAnsi="Times New Roman" w:cs="Times New Roman"/>
+          <w:sz w:val="36"/>
+          <w:szCs w:val="36"/>
+        </w:rPr>
+      </w:pPr>
+      <w:r>
+        <w:rPr>
+          <w:rFonts w:ascii="Times New Roman" w:hAnsi="Times New Roman" w:cs="Times New Roman"/>
+          <w:sz w:val="36"/>
+          <w:szCs w:val="36"/>
+        </w:rPr>
+        <w:t>Tesztekhez végzett kód:</w:t>
+      </w:r>
+    </w:p>
+    <w:p>
+      <w:pPr>
+        <w:jc w:val="both"/>
+        <w:rPr>
+          <w:rFonts w:ascii="Times New Roman" w:hAnsi="Times New Roman" w:cs="Times New Roman"/>
+          <w:sz w:val="36"/>
+          <w:szCs w:val="36"/>
+        </w:rPr>
+      </w:pPr>
+      <w:r>
+        <w:rPr>
+          <w:rFonts w:ascii="Times New Roman" w:hAnsi="Times New Roman" w:cs="Times New Roman"/>
+          <w:noProof/>
+          <w:sz w:val="36"/>
+          <w:szCs w:val="36"/>
+        </w:rPr>
+        <w:lastRenderedPageBreak/>
+        <w:drawing>
+          <wp:inline distT="0" distB="0" distL="0" distR="0" wp14:anchorId="520A2518" wp14:editId="4BE5FFF6">
+            <wp:extent cx="4286907" cy="3581400"/>
+            <wp:effectExtent l="0" t="0" r="0" b="0"/>
+            <wp:docPr id="2074802923" name="Kép 1"/>
+            <wp:cNvGraphicFramePr>
+              <a:graphicFrameLocks xmlns:a="http://schemas.openxmlformats.org/drawingml/2006/main" noChangeAspect="1"/>
+            </wp:cNvGraphicFramePr>
+            <a:graphic xmlns:a="http://schemas.openxmlformats.org/drawingml/2006/main">
+              <a:graphicData uri="http://schemas.openxmlformats.org/drawingml/2006/picture">
+                <pic:pic xmlns:pic="http://schemas.openxmlformats.org/drawingml/2006/picture">
+                  <pic:nvPicPr>
+                    <pic:cNvPr id="2074802923" name=""/>
+                    <pic:cNvPicPr/>
+                  </pic:nvPicPr>
+                  <pic:blipFill>
+                    <a:blip r:embed="rId9"/>
+                    <a:stretch>
+                      <a:fillRect/>
+                    </a:stretch>
+                  </pic:blipFill>
+                  <pic:spPr>
+                    <a:xfrm>
+                      <a:off x="0" y="0"/>
+                      <a:ext cx="4290555" cy="3584448"/>
+                    </a:xfrm>
+                    <a:prstGeom prst="rect">
+                      <a:avLst/>
+                    </a:prstGeom>
+                  </pic:spPr>
+                </pic:pic>
+              </a:graphicData>
+            </a:graphic>
+          </wp:inline>
+        </w:drawing>
+      </w:r>
+    </w:p>
+    <w:p>
+      <w:pPr>
+        <w:jc w:val="both"/>
+        <w:rPr>
+          <w:rFonts w:ascii="Times New Roman" w:hAnsi="Times New Roman" w:cs="Times New Roman"/>
+          <w:sz w:val="36"/>
+          <w:szCs w:val="36"/>
+        </w:rPr>
+      </w:pPr>
+      <w:r>
+        <w:rPr>
+          <w:rFonts w:ascii="Times New Roman" w:hAnsi="Times New Roman" w:cs="Times New Roman"/>
+          <w:noProof/>
+          <w:sz w:val="36"/>
+          <w:szCs w:val="36"/>
+        </w:rPr>
+        <w:drawing>
+          <wp:inline distT="0" distB="0" distL="0" distR="0" wp14:anchorId="1AD3D812" wp14:editId="40D46FBF">
+            <wp:extent cx="5760720" cy="4892040"/>
+            <wp:effectExtent l="0" t="0" r="0" b="3810"/>
+            <wp:docPr id="1891952295" name="Kép 1"/>
+            <wp:cNvGraphicFramePr>
+              <a:graphicFrameLocks xmlns:a="http://schemas.openxmlformats.org/drawingml/2006/main" noChangeAspect="1"/>
+            </wp:cNvGraphicFramePr>
+            <a:graphic xmlns:a="http://schemas.openxmlformats.org/drawingml/2006/main">
+              <a:graphicData uri="http://schemas.openxmlformats.org/drawingml/2006/picture">
+                <pic:pic xmlns:pic="http://schemas.openxmlformats.org/drawingml/2006/picture">
+                  <pic:nvPicPr>
+                    <pic:cNvPr id="1891952295" name=""/>
+                    <pic:cNvPicPr/>
+                  </pic:nvPicPr>
+                  <pic:blipFill>
+                    <a:blip r:embed="rId10"/>
+                    <a:stretch>
+                      <a:fillRect/>
+                    </a:stretch>
+                  </pic:blipFill>
+                  <pic:spPr>
+                    <a:xfrm>
+                      <a:off x="0" y="0"/>
+                      <a:ext cx="5760720" cy="4892040"/>
+                    </a:xfrm>
+                    <a:prstGeom prst="rect">
+                      <a:avLst/>
+                    </a:prstGeom>
+                  </pic:spPr>
+                </pic:pic>
+              </a:graphicData>
+            </a:graphic>
+          </wp:inline>
+        </w:drawing>
+      </w:r>
+    </w:p>
+    <w:p>
+      <w:pPr>
+        <w:jc w:val="both"/>
+        <w:rPr>
+          <w:rFonts w:ascii="Times New Roman" w:hAnsi="Times New Roman" w:cs="Times New Roman"/>
+          <w:sz w:val="36"/>
+          <w:szCs w:val="36"/>
+        </w:rPr>
+      </w:pPr>
+      <w:r>
+        <w:rPr>
+          <w:rFonts w:ascii="Times New Roman" w:hAnsi="Times New Roman" w:cs="Times New Roman"/>
+          <w:noProof/>
+          <w:sz w:val="36"/>
+          <w:szCs w:val="36"/>
+        </w:rPr>
+        <w:lastRenderedPageBreak/>
+        <w:drawing>
+          <wp:inline distT="0" distB="0" distL="0" distR="0" wp14:anchorId="71411A0E" wp14:editId="5A0F65EB">
+            <wp:extent cx="5760720" cy="4038600"/>
+            <wp:effectExtent l="0" t="0" r="0" b="0"/>
+            <wp:docPr id="482280050" name="Kép 1"/>
+            <wp:cNvGraphicFramePr>
+              <a:graphicFrameLocks xmlns:a="http://schemas.openxmlformats.org/drawingml/2006/main" noChangeAspect="1"/>
+            </wp:cNvGraphicFramePr>
+            <a:graphic xmlns:a="http://schemas.openxmlformats.org/drawingml/2006/main">
+              <a:graphicData uri="http://schemas.openxmlformats.org/drawingml/2006/picture">
+                <pic:pic xmlns:pic="http://schemas.openxmlformats.org/drawingml/2006/picture">
+                  <pic:nvPicPr>
+                    <pic:cNvPr id="482280050" name=""/>
+                    <pic:cNvPicPr/>
+                  </pic:nvPicPr>
+                  <pic:blipFill>
+                    <a:blip r:embed="rId11"/>
+                    <a:stretch>
+                      <a:fillRect/>
+                    </a:stretch>
+                  </pic:blipFill>
+                  <pic:spPr>
+                    <a:xfrm>
+                      <a:off x="0" y="0"/>
+                      <a:ext cx="5760720" cy="4038600"/>
+                    </a:xfrm>
+                    <a:prstGeom prst="rect">
+                      <a:avLst/>
+                    </a:prstGeom>
+                  </pic:spPr>
+                </pic:pic>
+              </a:graphicData>
+            </a:graphic>
+          </wp:inline>
+        </w:drawing>
+      </w:r>
+    </w:p>
+    <w:p>
+      <w:pPr>
+        <w:jc w:val="both"/>
+        <w:rPr>
+          <w:rFonts w:ascii="Times New Roman" w:hAnsi="Times New Roman" w:cs="Times New Roman"/>
+          <w:sz w:val="36"/>
+          <w:szCs w:val="36"/>
+        </w:rPr>
+      </w:pPr>
+    </w:p>
+    <w:p>
+      <w:pPr>
+        <w:pStyle w:val="Listaszerbekezds"/>
+        <w:numPr>
+          <w:ilvl w:val="0"/>
+          <w:numId w:val="1"/>
+        </w:numPr>
+        <w:jc w:val="both"/>
+        <w:rPr>
+          <w:rFonts w:ascii="Times New Roman" w:hAnsi="Times New Roman" w:cs="Times New Roman"/>
+          <w:sz w:val="36"/>
+          <w:szCs w:val="36"/>
+        </w:rPr>
+      </w:pPr>
+      <w:r>
+        <w:rPr>
+          <w:rFonts w:ascii="Times New Roman" w:hAnsi="Times New Roman" w:cs="Times New Roman"/>
+          <w:sz w:val="36"/>
+          <w:szCs w:val="36"/>
+        </w:rPr>
+        <w:t>2026-04-15</w:t>
+      </w:r>
+    </w:p>
+    <w:p>
+      <w:pPr>
+        <w:jc w:val="both"/>
+        <w:rPr>
+          <w:rFonts w:ascii="Times New Roman" w:hAnsi="Times New Roman" w:cs="Times New Roman"/>
+          <w:sz w:val="36"/>
+          <w:szCs w:val="36"/>
+        </w:rPr>
+      </w:pPr>
+      <w:r>
+        <w:rPr>
+          <w:rFonts w:ascii="Times New Roman" w:hAnsi="Times New Roman" w:cs="Times New Roman"/>
+          <w:sz w:val="36"/>
+          <w:szCs w:val="36"/>
+        </w:rPr>
+        <w:t>Zenebeküldés tesztelése: a felhasználó (diák) beküld egy zenét, miközben látja, hogy mely zenék lettek elfogadva vagy elutasítva. A beküldendő zenét az oldal ellenőrzi: a linkje fel van-e véve már az adatbázisba, a hossz megfelelően meg-van e adva és a megadott tartományba esik-e, meg vannak-e adva az adatok és nem túl hosszúak-e. Ha ezek stimmelnek, az alkalmazás felveszi a zenét az adatbázis ellenőrzés előtt álló zenéinek (</w:t>
+      </w:r>
+      <w:proofErr w:type="spellStart"/>
+      <w:r>
+        <w:rPr>
+          <w:rFonts w:ascii="Times New Roman" w:hAnsi="Times New Roman" w:cs="Times New Roman"/>
+          <w:sz w:val="36"/>
+          <w:szCs w:val="36"/>
+        </w:rPr>
+        <w:t>AcceptableMusic</w:t>
+      </w:r>
+      <w:proofErr w:type="spellEnd"/>
+      <w:r>
+        <w:rPr>
+          <w:rFonts w:ascii="Times New Roman" w:hAnsi="Times New Roman" w:cs="Times New Roman"/>
+          <w:sz w:val="36"/>
+          <w:szCs w:val="36"/>
+        </w:rPr>
+        <w:t>) táblájába.</w:t>
+      </w:r>
+    </w:p>
+    <w:p>
+      <w:pPr>
+        <w:jc w:val="both"/>
+        <w:rPr>
+          <w:rFonts w:ascii="Times New Roman" w:hAnsi="Times New Roman" w:cs="Times New Roman"/>
+          <w:sz w:val="36"/>
+          <w:szCs w:val="36"/>
+        </w:rPr>
+      </w:pPr>
+      <w:r>
+        <w:rPr>
+          <w:rFonts w:ascii="Times New Roman" w:hAnsi="Times New Roman" w:cs="Times New Roman"/>
+          <w:sz w:val="36"/>
+          <w:szCs w:val="36"/>
+        </w:rPr>
+        <w:t>Tesztekhez végzett kód:</w:t>
+      </w:r>
+    </w:p>
+    <w:p>
+      <w:pPr>
+        <w:jc w:val="both"/>
+        <w:rPr>
+          <w:rFonts w:ascii="Times New Roman" w:hAnsi="Times New Roman" w:cs="Times New Roman"/>
+          <w:sz w:val="36"/>
+          <w:szCs w:val="36"/>
+        </w:rPr>
+      </w:pPr>
+      <w:r>
+        <w:rPr>
+          <w:rFonts w:ascii="Times New Roman" w:hAnsi="Times New Roman" w:cs="Times New Roman"/>
+          <w:sz w:val="36"/>
+          <w:szCs w:val="36"/>
+        </w:rPr>
+        <w:lastRenderedPageBreak/>
+        <w:drawing>
+          <wp:inline distT="0" distB="0" distL="0" distR="0" wp14:anchorId="625BED98" wp14:editId="06A45CD1">
+            <wp:extent cx="4328160" cy="2882100"/>
+            <wp:effectExtent l="0" t="0" r="0" b="0"/>
+            <wp:docPr id="2067124765" name="Kép 1"/>
+            <wp:cNvGraphicFramePr>
+              <a:graphicFrameLocks xmlns:a="http://schemas.openxmlformats.org/drawingml/2006/main" noChangeAspect="1"/>
+            </wp:cNvGraphicFramePr>
+            <a:graphic xmlns:a="http://schemas.openxmlformats.org/drawingml/2006/main">
+              <a:graphicData uri="http://schemas.openxmlformats.org/drawingml/2006/picture">
+                <pic:pic xmlns:pic="http://schemas.openxmlformats.org/drawingml/2006/picture">
+                  <pic:nvPicPr>
+                    <pic:cNvPr id="2067124765" name=""/>
+                    <pic:cNvPicPr/>
+                  </pic:nvPicPr>
+                  <pic:blipFill>
+                    <a:blip r:embed="rId12"/>
+                    <a:stretch>
+                      <a:fillRect/>
+                    </a:stretch>
+                  </pic:blipFill>
+                  <pic:spPr>
+                    <a:xfrm>
+                      <a:off x="0" y="0"/>
+                      <a:ext cx="4332510" cy="2884996"/>
+                    </a:xfrm>
+                    <a:prstGeom prst="rect">
+                      <a:avLst/>
+                    </a:prstGeom>
+                  </pic:spPr>
+                </pic:pic>
+              </a:graphicData>
+            </a:graphic>
+          </wp:inline>
+        </w:drawing>
+      </w:r>
+    </w:p>
+    <w:p>
+      <w:pPr>
+        <w:jc w:val="both"/>
+        <w:rPr>
+          <w:rFonts w:ascii="Times New Roman" w:hAnsi="Times New Roman" w:cs="Times New Roman"/>
+          <w:sz w:val="36"/>
+          <w:szCs w:val="36"/>
+        </w:rPr>
+      </w:pPr>
+      <w:r>
+        <w:rPr>
+          <w:rFonts w:ascii="Times New Roman" w:hAnsi="Times New Roman" w:cs="Times New Roman"/>
+          <w:sz w:val="36"/>
+          <w:szCs w:val="36"/>
+        </w:rPr>
+        <w:drawing>
+          <wp:inline distT="0" distB="0" distL="0" distR="0" wp14:anchorId="60B1BF14" wp14:editId="6B6ECF3C">
+            <wp:extent cx="5101447" cy="3375660"/>
+            <wp:effectExtent l="0" t="0" r="4445" b="0"/>
+            <wp:docPr id="7031046" name="Kép 1"/>
+            <wp:cNvGraphicFramePr>
+              <a:graphicFrameLocks xmlns:a="http://schemas.openxmlformats.org/drawingml/2006/main" noChangeAspect="1"/>
+            </wp:cNvGraphicFramePr>
+            <a:graphic xmlns:a="http://schemas.openxmlformats.org/drawingml/2006/main">
+              <a:graphicData uri="http://schemas.openxmlformats.org/drawingml/2006/picture">
+                <pic:pic xmlns:pic="http://schemas.openxmlformats.org/drawingml/2006/picture">
+                  <pic:nvPicPr>
+                    <pic:cNvPr id="7031046" name=""/>
+                    <pic:cNvPicPr/>
+                  </pic:nvPicPr>
+                  <pic:blipFill>
+                    <a:blip r:embed="rId13"/>
+                    <a:stretch>
+                      <a:fillRect/>
+                    </a:stretch>
+                  </pic:blipFill>
+                  <pic:spPr>
+                    <a:xfrm>
+                      <a:off x="0" y="0"/>
+                      <a:ext cx="5112923" cy="3383254"/>
+                    </a:xfrm>
+                    <a:prstGeom prst="rect">
+                      <a:avLst/>
+                    </a:prstGeom>
+                  </pic:spPr>
+                </pic:pic>
+              </a:graphicData>
+            </a:graphic>
+          </wp:inline>
+        </w:drawing>
+      </w:r>
+    </w:p>
+    <w:p>
+      <w:pPr>
+        <w:jc w:val="both"/>
+        <w:rPr>
+          <w:rFonts w:ascii="Times New Roman" w:hAnsi="Times New Roman" w:cs="Times New Roman"/>
+          <w:sz w:val="36"/>
+          <w:szCs w:val="36"/>
+        </w:rPr>
+      </w:pPr>
+      <w:r>
+        <w:rPr>
+          <w:rFonts w:ascii="Times New Roman" w:hAnsi="Times New Roman" w:cs="Times New Roman"/>
+          <w:sz w:val="36"/>
+          <w:szCs w:val="36"/>
+        </w:rPr>
+        <w:lastRenderedPageBreak/>
+        <w:drawing>
+          <wp:inline distT="0" distB="0" distL="0" distR="0" wp14:anchorId="6FC34806" wp14:editId="37C96AA6">
+            <wp:extent cx="4645556" cy="2552700"/>
+            <wp:effectExtent l="0" t="0" r="3175" b="0"/>
+            <wp:docPr id="2075076636" name="Kép 1"/>
+            <wp:cNvGraphicFramePr>
+              <a:graphicFrameLocks xmlns:a="http://schemas.openxmlformats.org/drawingml/2006/main" noChangeAspect="1"/>
+            </wp:cNvGraphicFramePr>
+            <a:graphic xmlns:a="http://schemas.openxmlformats.org/drawingml/2006/main">
+              <a:graphicData uri="http://schemas.openxmlformats.org/drawingml/2006/picture">
+                <pic:pic xmlns:pic="http://schemas.openxmlformats.org/drawingml/2006/picture">
+                  <pic:nvPicPr>
+                    <pic:cNvPr id="2075076636" name=""/>
+                    <pic:cNvPicPr/>
+                  </pic:nvPicPr>
+                  <pic:blipFill>
+                    <a:blip r:embed="rId14"/>
+                    <a:stretch>
+                      <a:fillRect/>
+                    </a:stretch>
+                  </pic:blipFill>
+                  <pic:spPr>
+                    <a:xfrm>
+                      <a:off x="0" y="0"/>
+                      <a:ext cx="4648452" cy="2554292"/>
+                    </a:xfrm>
+                    <a:prstGeom prst="rect">
+                      <a:avLst/>
+                    </a:prstGeom>
+                  </pic:spPr>
+                </pic:pic>
+              </a:graphicData>
+            </a:graphic>
+          </wp:inline>
+        </w:drawing>
+      </w:r>
+    </w:p>
+    <w:p>
+      <w:pPr>
+        <w:jc w:val="both"/>
+        <w:rPr>
+          <w:rFonts w:ascii="Times New Roman" w:hAnsi="Times New Roman" w:cs="Times New Roman"/>
+          <w:sz w:val="36"/>
+          <w:szCs w:val="36"/>
+        </w:rPr>
+      </w:pPr>
+      <w:r>
+        <w:rPr>
+          <w:rFonts w:ascii="Times New Roman" w:hAnsi="Times New Roman" w:cs="Times New Roman"/>
+          <w:sz w:val="36"/>
+          <w:szCs w:val="36"/>
+        </w:rPr>
+        <w:drawing>
+          <wp:inline distT="0" distB="0" distL="0" distR="0" wp14:anchorId="7181BFB5" wp14:editId="13EC0E4C">
+            <wp:extent cx="4526280" cy="1722301"/>
+            <wp:effectExtent l="0" t="0" r="7620" b="0"/>
+            <wp:docPr id="294392261" name="Kép 1"/>
+            <wp:cNvGraphicFramePr>
+              <a:graphicFrameLocks xmlns:a="http://schemas.openxmlformats.org/drawingml/2006/main" noChangeAspect="1"/>
+            </wp:cNvGraphicFramePr>
+            <a:graphic xmlns:a="http://schemas.openxmlformats.org/drawingml/2006/main">
+              <a:graphicData uri="http://schemas.openxmlformats.org/drawingml/2006/picture">
+                <pic:pic xmlns:pic="http://schemas.openxmlformats.org/drawingml/2006/picture">
+                  <pic:nvPicPr>
+                    <pic:cNvPr id="294392261" name=""/>
+                    <pic:cNvPicPr/>
+                  </pic:nvPicPr>
+                  <pic:blipFill>
+                    <a:blip r:embed="rId15"/>
+                    <a:stretch>
+                      <a:fillRect/>
+                    </a:stretch>
+                  </pic:blipFill>
+                  <pic:spPr>
+                    <a:xfrm>
+                      <a:off x="0" y="0"/>
+                      <a:ext cx="4530646" cy="1723962"/>
+                    </a:xfrm>
+                    <a:prstGeom prst="rect">
+                      <a:avLst/>
+                    </a:prstGeom>
+                  </pic:spPr>
+                </pic:pic>
+              </a:graphicData>
+            </a:graphic>
+          </wp:inline>
+        </w:drawing>
+      </w:r>
+    </w:p>
+    <w:p>
+      <w:pPr>
+        <w:jc w:val="both"/>
+        <w:rPr>
+          <w:rFonts w:ascii="Times New Roman" w:hAnsi="Times New Roman" w:cs="Times New Roman"/>
+          <w:sz w:val="36"/>
+          <w:szCs w:val="36"/>
+        </w:rPr>
+      </w:pPr>
+      <w:r>
+        <w:rPr>
+          <w:rFonts w:ascii="Times New Roman" w:hAnsi="Times New Roman" w:cs="Times New Roman"/>
+          <w:sz w:val="36"/>
+          <w:szCs w:val="36"/>
+        </w:rPr>
+        <w:drawing>
+          <wp:inline distT="0" distB="0" distL="0" distR="0" wp14:anchorId="2236F5C1" wp14:editId="02950019">
+            <wp:extent cx="4823460" cy="2829636"/>
+            <wp:effectExtent l="0" t="0" r="0" b="8890"/>
+            <wp:docPr id="1662810095" name="Kép 1"/>
+            <wp:cNvGraphicFramePr>
+              <a:graphicFrameLocks xmlns:a="http://schemas.openxmlformats.org/drawingml/2006/main" noChangeAspect="1"/>
+            </wp:cNvGraphicFramePr>
+            <a:graphic xmlns:a="http://schemas.openxmlformats.org/drawingml/2006/main">
+              <a:graphicData uri="http://schemas.openxmlformats.org/drawingml/2006/picture">
+                <pic:pic xmlns:pic="http://schemas.openxmlformats.org/drawingml/2006/picture">
+                  <pic:nvPicPr>
+                    <pic:cNvPr id="1662810095" name=""/>
+                    <pic:cNvPicPr/>
+                  </pic:nvPicPr>
+                  <pic:blipFill>
+                    <a:blip r:embed="rId16"/>
+                    <a:stretch>
+                      <a:fillRect/>
+                    </a:stretch>
+                  </pic:blipFill>
+                  <pic:spPr>
+                    <a:xfrm>
+                      <a:off x="0" y="0"/>
+                      <a:ext cx="4824962" cy="2830517"/>
+                    </a:xfrm>
+                    <a:prstGeom prst="rect">
+                      <a:avLst/>
+                    </a:prstGeom>
+                  </pic:spPr>
+                </pic:pic>
+              </a:graphicData>
+            </a:graphic>
+          </wp:inline>
+        </w:drawing>
+      </w:r>
+    </w:p>
+    <w:p>
+      <w:pPr>
+        <w:jc w:val="both"/>
+        <w:rPr>
+          <w:rFonts w:ascii="Times New Roman" w:hAnsi="Times New Roman" w:cs="Times New Roman"/>
+          <w:sz w:val="36"/>
+          <w:szCs w:val="36"/>
+        </w:rPr>
+      </w:pPr>
+      <w:r>
+        <w:rPr>
+          <w:rFonts w:ascii="Times New Roman" w:hAnsi="Times New Roman" w:cs="Times New Roman"/>
+          <w:sz w:val="36"/>
+          <w:szCs w:val="36"/>
+        </w:rPr>
+        <w:lastRenderedPageBreak/>
+        <w:drawing>
+          <wp:inline distT="0" distB="0" distL="0" distR="0" wp14:anchorId="7449C29B" wp14:editId="28B5D16E">
+            <wp:extent cx="4480300" cy="2430780"/>
+            <wp:effectExtent l="0" t="0" r="0" b="7620"/>
+            <wp:docPr id="528366194" name="Kép 1"/>
+            <wp:cNvGraphicFramePr>
+              <a:graphicFrameLocks xmlns:a="http://schemas.openxmlformats.org/drawingml/2006/main" noChangeAspect="1"/>
+            </wp:cNvGraphicFramePr>
+            <a:graphic xmlns:a="http://schemas.openxmlformats.org/drawingml/2006/main">
+              <a:graphicData uri="http://schemas.openxmlformats.org/drawingml/2006/picture">
+                <pic:pic xmlns:pic="http://schemas.openxmlformats.org/drawingml/2006/picture">
+                  <pic:nvPicPr>
+                    <pic:cNvPr id="528366194" name=""/>
+                    <pic:cNvPicPr/>
+                  </pic:nvPicPr>
+                  <pic:blipFill>
+                    <a:blip r:embed="rId17"/>
+                    <a:stretch>
+                      <a:fillRect/>
+                    </a:stretch>
+                  </pic:blipFill>
+                  <pic:spPr>
+                    <a:xfrm>
+                      <a:off x="0" y="0"/>
+                      <a:ext cx="4483927" cy="2432748"/>
+                    </a:xfrm>
+                    <a:prstGeom prst="rect">
+                      <a:avLst/>
+                    </a:prstGeom>
+                  </pic:spPr>
+                </pic:pic>
+              </a:graphicData>
+            </a:graphic>
+          </wp:inline>
+        </w:drawing>
+      </w:r>
+    </w:p>
+    <w:p>
+      <w:pPr>
+        <w:jc w:val="both"/>
+        <w:rPr>
+          <w:rFonts w:ascii="Times New Roman" w:hAnsi="Times New Roman" w:cs="Times New Roman"/>
+          <w:sz w:val="36"/>
+          <w:szCs w:val="36"/>
+        </w:rPr>
+      </w:pPr>
+      <w:r>
+        <w:rPr>
+          <w:rFonts w:ascii="Times New Roman" w:hAnsi="Times New Roman" w:cs="Times New Roman"/>
+          <w:sz w:val="36"/>
+          <w:szCs w:val="36"/>
+        </w:rPr>
+        <w:drawing>
+          <wp:inline distT="0" distB="0" distL="0" distR="0" wp14:anchorId="5A310ED3" wp14:editId="162D8BF4">
+            <wp:extent cx="3903926" cy="2552700"/>
+            <wp:effectExtent l="0" t="0" r="1905" b="0"/>
+            <wp:docPr id="1689744029" name="Kép 1"/>
+            <wp:cNvGraphicFramePr>
+              <a:graphicFrameLocks xmlns:a="http://schemas.openxmlformats.org/drawingml/2006/main" noChangeAspect="1"/>
+            </wp:cNvGraphicFramePr>
+            <a:graphic xmlns:a="http://schemas.openxmlformats.org/drawingml/2006/main">
+              <a:graphicData uri="http://schemas.openxmlformats.org/drawingml/2006/picture">
+                <pic:pic xmlns:pic="http://schemas.openxmlformats.org/drawingml/2006/picture">
+                  <pic:nvPicPr>
+                    <pic:cNvPr id="1689744029" name=""/>
+                    <pic:cNvPicPr/>
+                  </pic:nvPicPr>
+                  <pic:blipFill>
+                    <a:blip r:embed="rId18"/>
+                    <a:stretch>
+                      <a:fillRect/>
+                    </a:stretch>
+                  </pic:blipFill>
+                  <pic:spPr>
+                    <a:xfrm>
+                      <a:off x="0" y="0"/>
+                      <a:ext cx="3915225" cy="2560088"/>
+                    </a:xfrm>
+                    <a:prstGeom prst="rect">
+                      <a:avLst/>
+                    </a:prstGeom>
+                  </pic:spPr>
+                </pic:pic>
+              </a:graphicData>
+            </a:graphic>
+          </wp:inline>
+        </w:drawing>
+      </w:r>
+    </w:p>
+    <w:p>
+      <w:pPr>
+        <w:jc w:val="both"/>
+        <w:rPr>
+          <w:rFonts w:ascii="Times New Roman" w:hAnsi="Times New Roman" w:cs="Times New Roman"/>
+          <w:sz w:val="36"/>
+          <w:szCs w:val="36"/>
+        </w:rPr>
+      </w:pPr>
+      <w:r>
+        <w:rPr>
+          <w:rFonts w:ascii="Times New Roman" w:hAnsi="Times New Roman" w:cs="Times New Roman"/>
+          <w:sz w:val="36"/>
+          <w:szCs w:val="36"/>
+        </w:rPr>
+        <w:drawing>
+          <wp:inline distT="0" distB="0" distL="0" distR="0" wp14:anchorId="142E948A" wp14:editId="22A87AA7">
+            <wp:extent cx="3557299" cy="3520440"/>
+            <wp:effectExtent l="0" t="0" r="5080" b="3810"/>
+            <wp:docPr id="1796874744" name="Kép 1"/>
+            <wp:cNvGraphicFramePr>
+              <a:graphicFrameLocks xmlns:a="http://schemas.openxmlformats.org/drawingml/2006/main" noChangeAspect="1"/>
+            </wp:cNvGraphicFramePr>
+            <a:graphic xmlns:a="http://schemas.openxmlformats.org/drawingml/2006/main">
+              <a:graphicData uri="http://schemas.openxmlformats.org/drawingml/2006/picture">
+                <pic:pic xmlns:pic="http://schemas.openxmlformats.org/drawingml/2006/picture">
+                  <pic:nvPicPr>
+                    <pic:cNvPr id="1796874744" name=""/>
+                    <pic:cNvPicPr/>
+                  </pic:nvPicPr>
+                  <pic:blipFill>
+                    <a:blip r:embed="rId19"/>
+                    <a:stretch>
+                      <a:fillRect/>
+                    </a:stretch>
+                  </pic:blipFill>
+                  <pic:spPr>
+                    <a:xfrm>
+                      <a:off x="0" y="0"/>
+                      <a:ext cx="3563206" cy="3526286"/>
+                    </a:xfrm>
+                    <a:prstGeom prst="rect">
+                      <a:avLst/>
+                    </a:prstGeom>
+                  </pic:spPr>
+                </pic:pic>
+              </a:graphicData>
+            </a:graphic>
+          </wp:inline>
+        </w:drawing>
       </w:r>
     </w:p>
     <w:sectPr>

</xml_diff>